<commit_message>
Rebuild outline around 10 downloadable references
Co-Authored-By: Claude Opus 5.5 <noreply@anthropic.com>
Claude-Session: https://claude.ai/code/session_01MuZJEATuP8hgu3rD83iwL2
</commit_message>
<xml_diff>
--- a/Burnout_Turnover_Intention_Outline.docx
+++ b/Burnout_Turnover_Intention_Outline.docx
@@ -93,19 +93,19 @@
         <w:ind w:left="360"/>
       </w:pPr>
       <w:r>
-        <w:t xml:space="preserve">2.1.1. The Three Dimensions of Job Burnout: Emotional Exhaustion, Depersonalization, and Reduced Personal Accomplishment</w:t>
-      </w:r>
-      <w:r>
-        <w:rPr>
-          <w:b w:val="false"/>
-          <w:bCs w:val="false"/>
-          <w:i/>
-          <w:iCs/>
-          <w:color w:val="555555"/>
-          <w:sz w:val="20"/>
-          <w:szCs w:val="20"/>
-        </w:rPr>
-        <w:t xml:space="preserve"> (Lee &amp; Ashforth, 1996)</w:t>
+        <w:t xml:space="preserve">2.1.1. Conceptualizing Job Burnout: Exhaustion, Cynicism, and Reduced Professional Efficacy</w:t>
+      </w:r>
+      <w:r>
+        <w:rPr>
+          <w:b w:val="false"/>
+          <w:bCs w:val="false"/>
+          <w:i/>
+          <w:iCs/>
+          <w:color w:val="555555"/>
+          <w:sz w:val="20"/>
+          <w:szCs w:val="20"/>
+        </w:rPr>
+        <w:t xml:space="preserve"> (Demerouti, 2024)</w:t>
       </w:r>
     </w:p>
     <w:p>
@@ -114,19 +114,19 @@
         <w:ind w:left="360"/>
       </w:pPr>
       <w:r>
-        <w:t xml:space="preserve">2.1.2. Work Demands, Job Resources, and Personality as Correlates of Burnout</w:t>
-      </w:r>
-      <w:r>
-        <w:rPr>
-          <w:b w:val="false"/>
-          <w:bCs w:val="false"/>
-          <w:i/>
-          <w:iCs/>
-          <w:color w:val="555555"/>
-          <w:sz w:val="20"/>
-          <w:szCs w:val="20"/>
-        </w:rPr>
-        <w:t xml:space="preserve"> (Lee &amp; Ashforth, 1996; Swider &amp; Zimmerman, 2010)</w:t>
+        <w:t xml:space="preserve">2.1.2. Job Demands and Job Resources as Determinants of Burnout</w:t>
+      </w:r>
+      <w:r>
+        <w:rPr>
+          <w:b w:val="false"/>
+          <w:bCs w:val="false"/>
+          <w:i/>
+          <w:iCs/>
+          <w:color w:val="555555"/>
+          <w:sz w:val="20"/>
+          <w:szCs w:val="20"/>
+        </w:rPr>
+        <w:t xml:space="preserve"> (Demerouti, 2024; Chênevert et al., 2021)</w:t>
       </w:r>
     </w:p>
     <w:p>
@@ -147,7 +147,7 @@
           <w:sz w:val="20"/>
           <w:szCs w:val="20"/>
         </w:rPr>
-        <w:t xml:space="preserve"> (Awa et al., 2010; Le Blanc &amp; Schaufeli, 2008; Demerouti, 2024)</w:t>
+        <w:t xml:space="preserve"> (Le Blanc &amp; Schaufeli, 2008; West et al., 2016)</w:t>
       </w:r>
     </w:p>
     <w:p>
@@ -156,19 +156,19 @@
         <w:ind w:left="720"/>
       </w:pPr>
       <w:r>
-        <w:t xml:space="preserve">2.1.3.1. Person-Directed (Individual-Focused) Interventions</w:t>
-      </w:r>
-      <w:r>
-        <w:rPr>
-          <w:b w:val="false"/>
-          <w:bCs w:val="false"/>
-          <w:i/>
-          <w:iCs/>
-          <w:color w:val="555555"/>
-          <w:sz w:val="20"/>
-          <w:szCs w:val="20"/>
-        </w:rPr>
-        <w:t xml:space="preserve"> (Awa et al., 2010; West et al., 2016)</w:t>
+        <w:t xml:space="preserve">2.1.3.1. Individual-Focused Interventions: Mindfulness, Stress Management, and Small-Group Programs</w:t>
+      </w:r>
+      <w:r>
+        <w:rPr>
+          <w:b w:val="false"/>
+          <w:bCs w:val="false"/>
+          <w:i/>
+          <w:iCs/>
+          <w:color w:val="555555"/>
+          <w:sz w:val="20"/>
+          <w:szCs w:val="20"/>
+        </w:rPr>
+        <w:t xml:space="preserve"> (West et al., 2016)</w:t>
       </w:r>
     </w:p>
     <w:p>
@@ -177,19 +177,19 @@
         <w:ind w:left="720"/>
       </w:pPr>
       <w:r>
-        <w:t xml:space="preserve">2.1.3.2. Organization-Directed (Structural) Interventions</w:t>
-      </w:r>
-      <w:r>
-        <w:rPr>
-          <w:b w:val="false"/>
-          <w:bCs w:val="false"/>
-          <w:i/>
-          <w:iCs/>
-          <w:color w:val="555555"/>
-          <w:sz w:val="20"/>
-          <w:szCs w:val="20"/>
-        </w:rPr>
-        <w:t xml:space="preserve"> (West et al., 2016; Demerouti &amp; Adaloudis, 2024)</w:t>
+        <w:t xml:space="preserve">2.1.3.2. Structural and Organizational Interventions: Workload and Work-Schedule Changes</w:t>
+      </w:r>
+      <w:r>
+        <w:rPr>
+          <w:b w:val="false"/>
+          <w:bCs w:val="false"/>
+          <w:i/>
+          <w:iCs/>
+          <w:color w:val="555555"/>
+          <w:sz w:val="20"/>
+          <w:szCs w:val="20"/>
+        </w:rPr>
+        <w:t xml:space="preserve"> (West et al., 2016; Demerouti, 2024)</w:t>
       </w:r>
     </w:p>
     <w:p>
@@ -198,19 +198,19 @@
         <w:ind w:left="720"/>
       </w:pPr>
       <w:r>
-        <w:t xml:space="preserve">2.1.3.3. Combined Individual–Organizational Intervention Programs</w:t>
-      </w:r>
-      <w:r>
-        <w:rPr>
-          <w:b w:val="false"/>
-          <w:bCs w:val="false"/>
-          <w:i/>
-          <w:iCs/>
-          <w:color w:val="555555"/>
-          <w:sz w:val="20"/>
-          <w:szCs w:val="20"/>
-        </w:rPr>
-        <w:t xml:space="preserve"> (Awa et al., 2010; Le Blanc &amp; Schaufeli, 2008)</w:t>
+        <w:t xml:space="preserve">2.1.3.3. Combined and Participatory Interventions: The Action Research Approach</w:t>
+      </w:r>
+      <w:r>
+        <w:rPr>
+          <w:b w:val="false"/>
+          <w:bCs w:val="false"/>
+          <w:i/>
+          <w:iCs/>
+          <w:color w:val="555555"/>
+          <w:sz w:val="20"/>
+          <w:szCs w:val="20"/>
+        </w:rPr>
+        <w:t xml:space="preserve"> (Le Blanc &amp; Schaufeli, 2008)</w:t>
       </w:r>
     </w:p>
     <w:p>
@@ -219,19 +219,19 @@
         <w:ind w:left="720"/>
       </w:pPr>
       <w:r>
-        <w:t xml:space="preserve">2.1.3.4. Effectiveness and Benefits of Controlled Burnout Interventions</w:t>
-      </w:r>
-      <w:r>
-        <w:rPr>
-          <w:b w:val="false"/>
-          <w:bCs w:val="false"/>
-          <w:i/>
-          <w:iCs/>
-          <w:color w:val="555555"/>
-          <w:sz w:val="20"/>
-          <w:szCs w:val="20"/>
-        </w:rPr>
-        <w:t xml:space="preserve"> (Maricuţoiu et al., 2016)</w:t>
+        <w:t xml:space="preserve">2.1.3.4. Benefits of Burnout Interventions for Employees and Organizations</w:t>
+      </w:r>
+      <w:r>
+        <w:rPr>
+          <w:b w:val="false"/>
+          <w:bCs w:val="false"/>
+          <w:i/>
+          <w:iCs/>
+          <w:color w:val="555555"/>
+          <w:sz w:val="20"/>
+          <w:szCs w:val="20"/>
+        </w:rPr>
+        <w:t xml:space="preserve"> (West et al., 2016; Demerouti, 2024)</w:t>
       </w:r>
     </w:p>
     <w:p>
@@ -249,19 +249,19 @@
         <w:ind w:left="360"/>
       </w:pPr>
       <w:r>
-        <w:t xml:space="preserve">2.2.1. Turnover Intention as the Nearest Predictor of Actual Turnover</w:t>
-      </w:r>
-      <w:r>
-        <w:rPr>
-          <w:b w:val="false"/>
-          <w:bCs w:val="false"/>
-          <w:i/>
-          <w:iCs/>
-          <w:color w:val="555555"/>
-          <w:sz w:val="20"/>
-          <w:szCs w:val="20"/>
-        </w:rPr>
-        <w:t xml:space="preserve"> (Tett &amp; Meyer, 1993)</w:t>
+        <w:t xml:space="preserve">2.2.1. Defining Turnover Intention and Its Role in Actual Employee Turnover</w:t>
+      </w:r>
+      <w:r>
+        <w:rPr>
+          <w:b w:val="false"/>
+          <w:bCs w:val="false"/>
+          <w:i/>
+          <w:iCs/>
+          <w:color w:val="555555"/>
+          <w:sz w:val="20"/>
+          <w:szCs w:val="20"/>
+        </w:rPr>
+        <w:t xml:space="preserve"> (Ozkan et al., 2020)</w:t>
       </w:r>
     </w:p>
     <w:p>
@@ -270,19 +270,19 @@
         <w:ind w:left="360"/>
       </w:pPr>
       <w:r>
-        <w:t xml:space="preserve">2.2.2. Antecedents of Turnover Intention: Job Satisfaction and Organizational Commitment</w:t>
-      </w:r>
-      <w:r>
-        <w:rPr>
-          <w:b w:val="false"/>
-          <w:bCs w:val="false"/>
-          <w:i/>
-          <w:iCs/>
-          <w:color w:val="555555"/>
-          <w:sz w:val="20"/>
-          <w:szCs w:val="20"/>
-        </w:rPr>
-        <w:t xml:space="preserve"> (Tett &amp; Meyer, 1993; Ozkan et al., 2020)</w:t>
+        <w:t xml:space="preserve">2.2.2. Antecedents of Turnover Intention: Job Satisfaction, Organizational Commitment, and Work Stress</w:t>
+      </w:r>
+      <w:r>
+        <w:rPr>
+          <w:b w:val="false"/>
+          <w:bCs w:val="false"/>
+          <w:i/>
+          <w:iCs/>
+          <w:color w:val="555555"/>
+          <w:sz w:val="20"/>
+          <w:szCs w:val="20"/>
+        </w:rPr>
+        <w:t xml:space="preserve"> (Ozkan et al., 2020)</w:t>
       </w:r>
     </w:p>
     <w:p>
@@ -303,7 +303,7 @@
           <w:sz w:val="20"/>
           <w:szCs w:val="20"/>
         </w:rPr>
-        <w:t xml:space="preserve"> (Al Mamun &amp; Hasan, 2017; Al-Suraihi et al., 2021)</w:t>
+        <w:t xml:space="preserve"> (Samuel &amp; Chipunza, 2009; Wang &amp; Wang, 2020)</w:t>
       </w:r>
     </w:p>
     <w:p>
@@ -312,7 +312,7 @@
         <w:ind w:left="720"/>
       </w:pPr>
       <w:r>
-        <w:t xml:space="preserve">2.2.3.1. Intrinsic Motivational Strategies: Training, Development, and Career Growth</w:t>
+        <w:t xml:space="preserve">2.2.3.1. Intrinsic Motivational Strategies: Training, Development, and Challenging Work</w:t>
       </w:r>
       <w:r>
         <w:rPr>
@@ -333,19 +333,19 @@
         <w:ind w:left="720"/>
       </w:pPr>
       <w:r>
-        <w:t xml:space="preserve">2.2.3.2. Extrinsic Motivational Strategies: Compensation, Rewards, and Recognition</w:t>
-      </w:r>
-      <w:r>
-        <w:rPr>
-          <w:b w:val="false"/>
-          <w:bCs w:val="false"/>
-          <w:i/>
-          <w:iCs/>
-          <w:color w:val="555555"/>
-          <w:sz w:val="20"/>
-          <w:szCs w:val="20"/>
-        </w:rPr>
-        <w:t xml:space="preserve"> (Samuel &amp; Chipunza, 2009; Al Mamun &amp; Hasan, 2017)</w:t>
+        <w:t xml:space="preserve">2.2.3.2. Extrinsic Motivational Strategies: Job Security, Compensation, and Recognition</w:t>
+      </w:r>
+      <w:r>
+        <w:rPr>
+          <w:b w:val="false"/>
+          <w:bCs w:val="false"/>
+          <w:i/>
+          <w:iCs/>
+          <w:color w:val="555555"/>
+          <w:sz w:val="20"/>
+          <w:szCs w:val="20"/>
+        </w:rPr>
+        <w:t xml:space="preserve"> (Samuel &amp; Chipunza, 2009)</w:t>
       </w:r>
     </w:p>
     <w:p>
@@ -354,19 +354,19 @@
         <w:ind w:left="720"/>
       </w:pPr>
       <w:r>
-        <w:t xml:space="preserve">2.2.3.3. Supportive Leadership and Work Environment</w:t>
-      </w:r>
-      <w:r>
-        <w:rPr>
-          <w:b w:val="false"/>
-          <w:bCs w:val="false"/>
-          <w:i/>
-          <w:iCs/>
-          <w:color w:val="555555"/>
-          <w:sz w:val="20"/>
-          <w:szCs w:val="20"/>
-        </w:rPr>
-        <w:t xml:space="preserve"> (Al Mamun &amp; Hasan, 2017; Al-Suraihi et al., 2021)</w:t>
+        <w:t xml:space="preserve">2.2.3.3. Perceived Organizational Support as a Retention Strategy</w:t>
+      </w:r>
+      <w:r>
+        <w:rPr>
+          <w:b w:val="false"/>
+          <w:bCs w:val="false"/>
+          <w:i/>
+          <w:iCs/>
+          <w:color w:val="555555"/>
+          <w:sz w:val="20"/>
+          <w:szCs w:val="20"/>
+        </w:rPr>
+        <w:t xml:space="preserve"> (Wang &amp; Wang, 2020)</w:t>
       </w:r>
     </w:p>
     <w:p>
@@ -375,19 +375,19 @@
         <w:ind w:left="720"/>
       </w:pPr>
       <w:r>
-        <w:t xml:space="preserve">2.2.3.4. Perceived Organizational Support as a Retention Mechanism</w:t>
-      </w:r>
-      <w:r>
-        <w:rPr>
-          <w:b w:val="false"/>
-          <w:bCs w:val="false"/>
-          <w:i/>
-          <w:iCs/>
-          <w:color w:val="555555"/>
-          <w:sz w:val="20"/>
-          <w:szCs w:val="20"/>
-        </w:rPr>
-        <w:t xml:space="preserve"> (Wang &amp; Wang, 2020)</w:t>
+        <w:t xml:space="preserve">2.2.3.4. Flexible Work Arrangements as a Retention Strategy</w:t>
+      </w:r>
+      <w:r>
+        <w:rPr>
+          <w:b w:val="false"/>
+          <w:bCs w:val="false"/>
+          <w:i/>
+          <w:iCs/>
+          <w:color w:val="555555"/>
+          <w:sz w:val="20"/>
+          <w:szCs w:val="20"/>
+        </w:rPr>
+        <w:t xml:space="preserve"> (Timms et al., 2015)</w:t>
       </w:r>
     </w:p>
     <w:p>
@@ -417,7 +417,7 @@
           <w:sz w:val="20"/>
           <w:szCs w:val="20"/>
         </w:rPr>
-        <w:t xml:space="preserve"> (Chênevert et al., 2021; Huynh et al., 2014)</w:t>
+        <w:t xml:space="preserve"> (Chênevert et al., 2021)</w:t>
       </w:r>
     </w:p>
     <w:p>
@@ -426,19 +426,19 @@
         <w:ind w:left="360"/>
       </w:pPr>
       <w:r>
-        <w:t xml:space="preserve">2.3.2. Separate Effects of Emotional Exhaustion and Depersonalization on Turnover Intention</w:t>
-      </w:r>
-      <w:r>
-        <w:rPr>
-          <w:b w:val="false"/>
-          <w:bCs w:val="false"/>
-          <w:i/>
-          <w:iCs/>
-          <w:color w:val="555555"/>
-          <w:sz w:val="20"/>
-          <w:szCs w:val="20"/>
-        </w:rPr>
-        <w:t xml:space="preserve"> (Park et al., 2021; Swider &amp; Zimmerman, 2010)</w:t>
+        <w:t xml:space="preserve">2.3.2. The Multidimensional Effects of Burnout on Intention to Leave</w:t>
+      </w:r>
+      <w:r>
+        <w:rPr>
+          <w:b w:val="false"/>
+          <w:bCs w:val="false"/>
+          <w:i/>
+          <w:iCs/>
+          <w:color w:val="555555"/>
+          <w:sz w:val="20"/>
+          <w:szCs w:val="20"/>
+        </w:rPr>
+        <w:t xml:space="preserve"> (Chen et al., 2024; Dominguez et al., 2018)</w:t>
       </w:r>
     </w:p>
     <w:p>
@@ -468,19 +468,19 @@
         <w:ind w:left="720"/>
       </w:pPr>
       <w:r>
-        <w:t xml:space="preserve">2.3.3.1. Leadership Resources: Transformational Leadership as a Moderator of the Exhaustion–Turnover Link</w:t>
-      </w:r>
-      <w:r>
-        <w:rPr>
-          <w:b w:val="false"/>
-          <w:bCs w:val="false"/>
-          <w:i/>
-          <w:iCs/>
-          <w:color w:val="555555"/>
-          <w:sz w:val="20"/>
-          <w:szCs w:val="20"/>
-        </w:rPr>
-        <w:t xml:space="preserve"> (Green et al., 2013)</w:t>
+        <w:t xml:space="preserve">2.3.3.1. Social Support as a Buffer Against Burnout and Turnover Intention</w:t>
+      </w:r>
+      <w:r>
+        <w:rPr>
+          <w:b w:val="false"/>
+          <w:bCs w:val="false"/>
+          <w:i/>
+          <w:iCs/>
+          <w:color w:val="555555"/>
+          <w:sz w:val="20"/>
+          <w:szCs w:val="20"/>
+        </w:rPr>
+        <w:t xml:space="preserve"> (Chen et al., 2024)</w:t>
       </w:r>
     </w:p>
     <w:p>
@@ -489,19 +489,19 @@
         <w:ind w:left="720"/>
       </w:pPr>
       <w:r>
-        <w:t xml:space="preserve">2.3.3.2. Job-Design Resources: Job Crafting to Reduce Emotional Exhaustion and Intention to Leave</w:t>
-      </w:r>
-      <w:r>
-        <w:rPr>
-          <w:b w:val="false"/>
-          <w:bCs w:val="false"/>
-          <w:i/>
-          <w:iCs/>
-          <w:color w:val="555555"/>
-          <w:sz w:val="20"/>
-          <w:szCs w:val="20"/>
-        </w:rPr>
-        <w:t xml:space="preserve"> (Shin et al., 2020; Dominguez et al., 2018)</w:t>
+        <w:t xml:space="preserve">2.3.3.2. Psychological Capital as a Personal Resource Against Burnout-Driven Turnover</w:t>
+      </w:r>
+      <w:r>
+        <w:rPr>
+          <w:b w:val="false"/>
+          <w:bCs w:val="false"/>
+          <w:i/>
+          <w:iCs/>
+          <w:color w:val="555555"/>
+          <w:sz w:val="20"/>
+          <w:szCs w:val="20"/>
+        </w:rPr>
+        <w:t xml:space="preserve"> (Chen et al., 2024)</w:t>
       </w:r>
     </w:p>
     <w:p>
@@ -510,19 +510,19 @@
         <w:ind w:left="720"/>
       </w:pPr>
       <w:r>
-        <w:t xml:space="preserve">2.3.3.3. Organizational Resources: Flexible Work Arrangements and Work–Life Balance</w:t>
-      </w:r>
-      <w:r>
-        <w:rPr>
-          <w:b w:val="false"/>
-          <w:bCs w:val="false"/>
-          <w:i/>
-          <w:iCs/>
-          <w:color w:val="555555"/>
-          <w:sz w:val="20"/>
-          <w:szCs w:val="20"/>
-        </w:rPr>
-        <w:t xml:space="preserve"> (Timms et al., 2015; Boamah et al., 2022)</w:t>
+        <w:t xml:space="preserve">2.3.3.3. Job Crafting as a Means of Reducing Burnout and Intention to Leave</w:t>
+      </w:r>
+      <w:r>
+        <w:rPr>
+          <w:b w:val="false"/>
+          <w:bCs w:val="false"/>
+          <w:i/>
+          <w:iCs/>
+          <w:color w:val="555555"/>
+          <w:sz w:val="20"/>
+          <w:szCs w:val="20"/>
+        </w:rPr>
+        <w:t xml:space="preserve"> (Dominguez et al., 2018)</w:t>
       </w:r>
     </w:p>
     <w:p>
@@ -531,19 +531,19 @@
         <w:ind w:left="720"/>
       </w:pPr>
       <w:r>
-        <w:t xml:space="preserve">2.3.3.4. Personal and Social Resources: Psychological Capital and Social Support</w:t>
-      </w:r>
-      <w:r>
-        <w:rPr>
-          <w:b w:val="false"/>
-          <w:bCs w:val="false"/>
-          <w:i/>
-          <w:iCs/>
-          <w:color w:val="555555"/>
-          <w:sz w:val="20"/>
-          <w:szCs w:val="20"/>
-        </w:rPr>
-        <w:t xml:space="preserve"> (Zambrano-Chumo &amp; Guevara, 2024; Chen et al., 2024)</w:t>
+        <w:t xml:space="preserve">2.3.3.4. Organizational Support and Flexible Work as Protective Resources</w:t>
+      </w:r>
+      <w:r>
+        <w:rPr>
+          <w:b w:val="false"/>
+          <w:bCs w:val="false"/>
+          <w:i/>
+          <w:iCs/>
+          <w:color w:val="555555"/>
+          <w:sz w:val="20"/>
+          <w:szCs w:val="20"/>
+        </w:rPr>
+        <w:t xml:space="preserve"> (Wang &amp; Wang, 2020; Timms et al., 2015)</w:t>
       </w:r>
     </w:p>
     <w:p>
@@ -612,178 +612,26 @@
           <w:i w:val="false"/>
           <w:iCs w:val="false"/>
         </w:rPr>
-        <w:t xml:space="preserve">Al Mamun, C. A., &amp; Hasan, M. N. (2017). Factors affecting employee turnover and sound retention strategies in business organization: A conceptual view. </w:t>
-      </w:r>
-      <w:r>
-        <w:rPr>
-          <w:i/>
-          <w:iCs/>
-        </w:rPr>
-        <w:t xml:space="preserve">Problems and Perspectives in Management, 15</w:t>
-      </w:r>
-      <w:r>
-        <w:rPr>
-          <w:i w:val="false"/>
-          <w:iCs w:val="false"/>
-        </w:rPr>
-        <w:t xml:space="preserve">(1), 63–71.</w:t>
+        <w:t xml:space="preserve">Chen, G., Wang, J., Huang, Q., Sang, L., Yan, J., Chen, R., Cheng, J., Wang, L., Zhang, D., &amp; Ding, H. (2024). Social support, psychological capital, multidimensional job burnout, and turnover intention of primary medical staff: A path analysis drawing on conservation of resources theory. </w:t>
+      </w:r>
+      <w:r>
+        <w:rPr>
+          <w:i/>
+          <w:iCs/>
+        </w:rPr>
+        <w:t xml:space="preserve">Human Resources for Health, 22</w:t>
+      </w:r>
+      <w:r>
+        <w:rPr>
+          <w:i w:val="false"/>
+          <w:iCs w:val="false"/>
+        </w:rPr>
+        <w:t xml:space="preserve">(1), 42.</w:t>
       </w:r>
       <w:r>
         <w:t xml:space="preserve"> Full text (free): </w:t>
       </w:r>
-      <w:hyperlink w:history="1" r:id="rIdcur9ftspigaxe5mgsz6en">
-        <w:r>
-          <w:rPr>
-            <w:rStyle w:val="Hyperlink"/>
-          </w:rPr>
-          <w:t xml:space="preserve">http://digitalrepository.cipmlk.org/bitstream/handle/1/998/21.34%20Factors%20affecting%20employee%20turnover%20and%20sound%20retention%20strategies%20in%20business.pdf</w:t>
-        </w:r>
-      </w:hyperlink>
-    </w:p>
-    <w:p>
-      <w:pPr>
-        <w:spacing w:after="160" w:line="360"/>
-        <w:ind w:left="720" w:hanging="720"/>
-      </w:pPr>
-      <w:r>
-        <w:rPr>
-          <w:i w:val="false"/>
-          <w:iCs w:val="false"/>
-        </w:rPr>
-        <w:t xml:space="preserve">Al-Suraihi, W. A., Samikon, S. A., Al-Suraihi, A. H. A., &amp; Ibrahim, I. (2021). </w:t>
-      </w:r>
-      <w:r>
-        <w:rPr>
-          <w:i/>
-          <w:iCs/>
-        </w:rPr>
-        <w:t xml:space="preserve">Employee turnover: Causes, importance and retention strategies</w:t>
-      </w:r>
-      <w:r>
-        <w:rPr>
-          <w:i w:val="false"/>
-          <w:iCs w:val="false"/>
-        </w:rPr>
-        <w:t xml:space="preserve">.</w:t>
-      </w:r>
-      <w:r>
-        <w:t xml:space="preserve"> Full text (free): </w:t>
-      </w:r>
-      <w:hyperlink w:history="1" r:id="rIdwpq6pavi9_tcm6aymv0x3">
-        <w:r>
-          <w:rPr>
-            <w:rStyle w:val="Hyperlink"/>
-          </w:rPr>
-          <w:t xml:space="preserve">http://digitalrepository.cipmlk.org/bitstream/handle/1/979/21.12%20Employee%20Turnover%20Causes%2C%20Importance%20and.pdf</w:t>
-        </w:r>
-      </w:hyperlink>
-    </w:p>
-    <w:p>
-      <w:pPr>
-        <w:spacing w:after="160" w:line="360"/>
-        <w:ind w:left="720" w:hanging="720"/>
-      </w:pPr>
-      <w:r>
-        <w:rPr>
-          <w:i w:val="false"/>
-          <w:iCs w:val="false"/>
-        </w:rPr>
-        <w:t xml:space="preserve">Awa, W. L., Plaumann, M., &amp; Walter, U. (2010). Burnout prevention: A review of intervention programs. </w:t>
-      </w:r>
-      <w:r>
-        <w:rPr>
-          <w:i/>
-          <w:iCs/>
-        </w:rPr>
-        <w:t xml:space="preserve">Patient Education and Counseling, 78</w:t>
-      </w:r>
-      <w:r>
-        <w:rPr>
-          <w:i w:val="false"/>
-          <w:iCs w:val="false"/>
-        </w:rPr>
-        <w:t xml:space="preserve">(2), 184–190.</w:t>
-      </w:r>
-      <w:r>
-        <w:t xml:space="preserve"> Publisher page: </w:t>
-      </w:r>
-      <w:hyperlink w:history="1" r:id="rIdmuxyhfjkvdys8lnfl4si3">
-        <w:r>
-          <w:rPr>
-            <w:rStyle w:val="Hyperlink"/>
-          </w:rPr>
-          <w:t xml:space="preserve">https://www.sciencedirect.com/science/article/pii/S0738399109001621</w:t>
-        </w:r>
-      </w:hyperlink>
-    </w:p>
-    <w:p>
-      <w:pPr>
-        <w:spacing w:after="160" w:line="360"/>
-        <w:ind w:left="720" w:hanging="720"/>
-      </w:pPr>
-      <w:r>
-        <w:rPr>
-          <w:i w:val="false"/>
-          <w:iCs w:val="false"/>
-        </w:rPr>
-        <w:t xml:space="preserve">Boamah, S. A., Hamadi, H. Y., Havaei, F., Smith, H., &amp; Webb, F. (2022). Striking a balance between work and play: The effects of work–life interference and burnout on faculty turnover intentions and career satisfaction. </w:t>
-      </w:r>
-      <w:r>
-        <w:rPr>
-          <w:i/>
-          <w:iCs/>
-        </w:rPr>
-        <w:t xml:space="preserve">International Journal of Environmental Research and Public Health, 19</w:t>
-      </w:r>
-      <w:r>
-        <w:rPr>
-          <w:i w:val="false"/>
-          <w:iCs w:val="false"/>
-        </w:rPr>
-        <w:t xml:space="preserve">(2), 809.</w:t>
-      </w:r>
-      <w:r>
-        <w:t xml:space="preserve"> Full text (free): </w:t>
-      </w:r>
-      <w:hyperlink w:history="1" r:id="rIdk7w0ih6kmx-1msifynh73">
-        <w:r>
-          <w:rPr>
-            <w:rStyle w:val="Hyperlink"/>
-          </w:rPr>
-          <w:t xml:space="preserve">https://www.mdpi.com/1660-4601/19/2/809</w:t>
-        </w:r>
-      </w:hyperlink>
-    </w:p>
-    <w:p>
-      <w:pPr>
-        <w:spacing w:after="160" w:line="360"/>
-        <w:ind w:left="720" w:hanging="720"/>
-      </w:pPr>
-      <w:r>
-        <w:rPr>
-          <w:i w:val="false"/>
-          <w:iCs w:val="false"/>
-        </w:rPr>
-        <w:t xml:space="preserve">Chen, G., Wang, J., Huang, Q., Sang, L., Yan, J., Chen, R., Cheng, J., Wang, L., Zhang, D., &amp; Ding, H. (2024). Social support, psychological capital, multidimensional job burnout, and turnover intention of primary medical staff: A path analysis drawing on conservation of resources theory. </w:t>
-      </w:r>
-      <w:r>
-        <w:rPr>
-          <w:i/>
-          <w:iCs/>
-        </w:rPr>
-        <w:t xml:space="preserve">Human Resources for Health, 22</w:t>
-      </w:r>
-      <w:r>
-        <w:rPr>
-          <w:i w:val="false"/>
-          <w:iCs w:val="false"/>
-        </w:rPr>
-        <w:t xml:space="preserve">(1), 42.</w:t>
-      </w:r>
-      <w:r>
-        <w:t xml:space="preserve"> Full text (free): </w:t>
-      </w:r>
-      <w:hyperlink w:history="1" r:id="rIdas-kv-c4rtmftb7sph6td">
+      <w:hyperlink w:history="1" r:id="rIdntyxuh2iyy6b3d5h1ota-">
         <w:r>
           <w:rPr>
             <w:rStyle w:val="Hyperlink"/>
@@ -821,7 +669,7 @@
       <w:r>
         <w:t xml:space="preserve"> Full text (free): </w:t>
       </w:r>
-      <w:hyperlink w:history="1" r:id="rIdoivxt6khbwc1wbgrvmsaw">
+      <w:hyperlink w:history="1" r:id="rIdxgas92qt4mpejaox9dtdm">
         <w:r>
           <w:rPr>
             <w:rStyle w:val="Hyperlink"/>
@@ -859,7 +707,7 @@
       <w:r>
         <w:t xml:space="preserve"> Full text (free): </w:t>
       </w:r>
-      <w:hyperlink w:history="1" r:id="rIdtlcycrfbmhj_tdkpjguif">
+      <w:hyperlink w:history="1" r:id="rId0biytbursninti3e0m5nv">
         <w:r>
           <w:rPr>
             <w:rStyle w:val="Hyperlink"/>
@@ -878,64 +726,26 @@
           <w:i w:val="false"/>
           <w:iCs w:val="false"/>
         </w:rPr>
-        <w:t xml:space="preserve">Demerouti, E., &amp; Adaloudis, N. (2024). </w:t>
-      </w:r>
-      <w:r>
-        <w:rPr>
-          <w:i/>
-          <w:iCs/>
-        </w:rPr>
-        <w:t xml:space="preserve">Addressing burnout in organisations: A literature review</w:t>
-      </w:r>
-      <w:r>
-        <w:rPr>
-          <w:i w:val="false"/>
-          <w:iCs w:val="false"/>
-        </w:rPr>
-        <w:t xml:space="preserve"> [Working paper]. Eindhoven University of Technology.</w:t>
+        <w:t xml:space="preserve">Dominguez, L. C., Stassen, L., de Grave, W., Sanabria, A., Alfonso, E., &amp; Dolmans, D. (2018). Taking control: Is job crafting related to the intention to leave surgical training? </w:t>
+      </w:r>
+      <w:r>
+        <w:rPr>
+          <w:i/>
+          <w:iCs/>
+        </w:rPr>
+        <w:t xml:space="preserve">PLOS ONE, 13</w:t>
+      </w:r>
+      <w:r>
+        <w:rPr>
+          <w:i w:val="false"/>
+          <w:iCs w:val="false"/>
+        </w:rPr>
+        <w:t xml:space="preserve">(6), e0197276.</w:t>
       </w:r>
       <w:r>
         <w:t xml:space="preserve"> Full text (free): </w:t>
       </w:r>
-      <w:hyperlink w:history="1" r:id="rIdzopiieaxibme96fsxwrza">
-        <w:r>
-          <w:rPr>
-            <w:rStyle w:val="Hyperlink"/>
-          </w:rPr>
-          <w:t xml:space="preserve">https://research.tue.nl/files/352430610/ssrn-4718143.pdf</w:t>
-        </w:r>
-      </w:hyperlink>
-    </w:p>
-    <w:p>
-      <w:pPr>
-        <w:spacing w:after="160" w:line="360"/>
-        <w:ind w:left="720" w:hanging="720"/>
-      </w:pPr>
-      <w:r>
-        <w:rPr>
-          <w:i w:val="false"/>
-          <w:iCs w:val="false"/>
-        </w:rPr>
-        <w:t xml:space="preserve">Dominguez, L. C., Stassen, L., de Grave, W., Sanabria, A., Alfonso, E., &amp; Dolmans, D. (2018). Taking control: Is job crafting related to the intention to leave surgical training? </w:t>
-      </w:r>
-      <w:r>
-        <w:rPr>
-          <w:i/>
-          <w:iCs/>
-        </w:rPr>
-        <w:t xml:space="preserve">PLOS ONE, 13</w:t>
-      </w:r>
-      <w:r>
-        <w:rPr>
-          <w:i w:val="false"/>
-          <w:iCs w:val="false"/>
-        </w:rPr>
-        <w:t xml:space="preserve">(6), e0197276.</w:t>
-      </w:r>
-      <w:r>
-        <w:t xml:space="preserve"> Full text (free): </w:t>
-      </w:r>
-      <w:hyperlink w:history="1" r:id="rIdsg7oaw4trrxpvdjolg_zl">
+      <w:hyperlink w:history="1" r:id="rIdoxa8nze8fx7bahoo8vz7l">
         <w:r>
           <w:rPr>
             <w:rStyle w:val="Hyperlink"/>
@@ -954,102 +764,26 @@
           <w:i w:val="false"/>
           <w:iCs w:val="false"/>
         </w:rPr>
-        <w:t xml:space="preserve">Green, A. E., Miller, E. A., &amp; Aarons, G. A. (2013). Transformational leadership moderates the relationship between emotional exhaustion and turnover intention among community mental health providers. </w:t>
-      </w:r>
-      <w:r>
-        <w:rPr>
-          <w:i/>
-          <w:iCs/>
-        </w:rPr>
-        <w:t xml:space="preserve">Community Mental Health Journal, 49</w:t>
-      </w:r>
-      <w:r>
-        <w:rPr>
-          <w:i w:val="false"/>
-          <w:iCs w:val="false"/>
-        </w:rPr>
-        <w:t xml:space="preserve">(4), 373–379.</w:t>
+        <w:t xml:space="preserve">Le Blanc, P. M., &amp; Schaufeli, W. B. (2008). Burnout interventions: An overview and illustration. In </w:t>
+      </w:r>
+      <w:r>
+        <w:rPr>
+          <w:i/>
+          <w:iCs/>
+        </w:rPr>
+        <w:t xml:space="preserve">Handbook of stress and burnout in health care</w:t>
+      </w:r>
+      <w:r>
+        <w:rPr>
+          <w:i w:val="false"/>
+          <w:iCs w:val="false"/>
+        </w:rPr>
+        <w:t xml:space="preserve"> (pp. 201–215).</w:t>
       </w:r>
       <w:r>
         <w:t xml:space="preserve"> Full text (free): </w:t>
       </w:r>
-      <w:hyperlink w:history="1" r:id="rIdegcabzvfp7sdroaa3xurk">
-        <w:r>
-          <w:rPr>
-            <w:rStyle w:val="Hyperlink"/>
-          </w:rPr>
-          <w:t xml:space="preserve">https://pmc.ncbi.nlm.nih.gov/articles/PMC4209723/pdf/nihms636338.pdf</w:t>
-        </w:r>
-      </w:hyperlink>
-    </w:p>
-    <w:p>
-      <w:pPr>
-        <w:spacing w:after="160" w:line="360"/>
-        <w:ind w:left="720" w:hanging="720"/>
-      </w:pPr>
-      <w:r>
-        <w:rPr>
-          <w:i w:val="false"/>
-          <w:iCs w:val="false"/>
-        </w:rPr>
-        <w:t xml:space="preserve">Huynh, J. Y., Xanthopoulou, D., &amp; Winefield, A. H. (2014). The job demands-resources model in emergency service volunteers: Examining the mediating roles of exhaustion, work engagement and organizational connectedness. </w:t>
-      </w:r>
-      <w:r>
-        <w:rPr>
-          <w:i/>
-          <w:iCs/>
-        </w:rPr>
-        <w:t xml:space="preserve">Work &amp; Stress, 28</w:t>
-      </w:r>
-      <w:r>
-        <w:rPr>
-          <w:i w:val="false"/>
-          <w:iCs w:val="false"/>
-        </w:rPr>
-        <w:t xml:space="preserve">(3), 305–322.</w:t>
-      </w:r>
-      <w:r>
-        <w:t xml:space="preserve"> Publisher page: </w:t>
-      </w:r>
-      <w:hyperlink w:history="1" r:id="rIdl8xxufv2h16bljsnzlmou">
-        <w:r>
-          <w:rPr>
-            <w:rStyle w:val="Hyperlink"/>
-          </w:rPr>
-          <w:t xml:space="preserve">https://doi.org/10.1080/02678373.2014.936922</w:t>
-        </w:r>
-      </w:hyperlink>
-    </w:p>
-    <w:p>
-      <w:pPr>
-        <w:spacing w:after="160" w:line="360"/>
-        <w:ind w:left="720" w:hanging="720"/>
-      </w:pPr>
-      <w:r>
-        <w:rPr>
-          <w:i w:val="false"/>
-          <w:iCs w:val="false"/>
-        </w:rPr>
-        <w:t xml:space="preserve">Le Blanc, P. M., &amp; Schaufeli, W. B. (2008). Burnout interventions: An overview and illustration. In </w:t>
-      </w:r>
-      <w:r>
-        <w:rPr>
-          <w:i/>
-          <w:iCs/>
-        </w:rPr>
-        <w:t xml:space="preserve">Handbook of stress and burnout in health care</w:t>
-      </w:r>
-      <w:r>
-        <w:rPr>
-          <w:i w:val="false"/>
-          <w:iCs w:val="false"/>
-        </w:rPr>
-        <w:t xml:space="preserve"> (pp. 201–215).</w:t>
-      </w:r>
-      <w:r>
-        <w:t xml:space="preserve"> Full text (free): </w:t>
-      </w:r>
-      <w:hyperlink w:history="1" r:id="rIdzwy8oqtsmayqusqjchpcy">
+      <w:hyperlink w:history="1" r:id="rIddhybgczozpjpb9etot5gn">
         <w:r>
           <w:rPr>
             <w:rStyle w:val="Hyperlink"/>
@@ -1068,82 +802,6 @@
           <w:i w:val="false"/>
           <w:iCs w:val="false"/>
         </w:rPr>
-        <w:t xml:space="preserve">Lee, R. T., &amp; Ashforth, B. E. (1996). A meta-analytic examination of the correlates of the three dimensions of job burnout. </w:t>
-      </w:r>
-      <w:r>
-        <w:rPr>
-          <w:i/>
-          <w:iCs/>
-        </w:rPr>
-        <w:t xml:space="preserve">Journal of Applied Psychology, 81</w:t>
-      </w:r>
-      <w:r>
-        <w:rPr>
-          <w:i w:val="false"/>
-          <w:iCs w:val="false"/>
-        </w:rPr>
-        <w:t xml:space="preserve">(2), 123–133.</w:t>
-      </w:r>
-      <w:r>
-        <w:t xml:space="preserve"> Publisher page: </w:t>
-      </w:r>
-      <w:hyperlink w:history="1" r:id="rIdliagh8ucezhuejw4rkhjg">
-        <w:r>
-          <w:rPr>
-            <w:rStyle w:val="Hyperlink"/>
-          </w:rPr>
-          <w:t xml:space="preserve">https://psycnet.apa.org/record/1996-00291-001</w:t>
-        </w:r>
-      </w:hyperlink>
-    </w:p>
-    <w:p>
-      <w:pPr>
-        <w:spacing w:after="160" w:line="360"/>
-        <w:ind w:left="720" w:hanging="720"/>
-      </w:pPr>
-      <w:r>
-        <w:rPr>
-          <w:i w:val="false"/>
-          <w:iCs w:val="false"/>
-        </w:rPr>
-        <w:t xml:space="preserve">Maricuţoiu, L. P., Sava, F. A., &amp; Butta, O. (2016). The effectiveness of controlled interventions on employees’ burnout: A meta-analysis. </w:t>
-      </w:r>
-      <w:r>
-        <w:rPr>
-          <w:i/>
-          <w:iCs/>
-        </w:rPr>
-        <w:t xml:space="preserve">Journal of Occupational and Organizational Psychology, 89</w:t>
-      </w:r>
-      <w:r>
-        <w:rPr>
-          <w:i w:val="false"/>
-          <w:iCs w:val="false"/>
-        </w:rPr>
-        <w:t xml:space="preserve">(1), 1–27.</w:t>
-      </w:r>
-      <w:r>
-        <w:t xml:space="preserve"> Publisher page: </w:t>
-      </w:r>
-      <w:hyperlink w:history="1" r:id="rIdnjxh5q44jx_rritayyfiv">
-        <w:r>
-          <w:rPr>
-            <w:rStyle w:val="Hyperlink"/>
-          </w:rPr>
-          <w:t xml:space="preserve">https://doi.org/10.1111/joop.12099</w:t>
-        </w:r>
-      </w:hyperlink>
-    </w:p>
-    <w:p>
-      <w:pPr>
-        <w:spacing w:after="160" w:line="360"/>
-        <w:ind w:left="720" w:hanging="720"/>
-      </w:pPr>
-      <w:r>
-        <w:rPr>
-          <w:i w:val="false"/>
-          <w:iCs w:val="false"/>
-        </w:rPr>
         <w:t xml:space="preserve">Ozkan, A., Elci, M., Karabay, M., Kitapci, H., &amp; Garip, C. (2020). Antecedents of turnover intention: A meta-analysis study in the United States. </w:t>
       </w:r>
       <w:r>
@@ -1163,7 +821,7 @@
       <w:r>
         <w:t xml:space="preserve"> Full text (free): </w:t>
       </w:r>
-      <w:hyperlink w:history="1" r:id="rIdkypragewnpkinupl1a2ct">
+      <w:hyperlink w:history="1" r:id="rIdyyhi-b7jhmuja5copo7sj">
         <w:r>
           <w:rPr>
             <w:rStyle w:val="Hyperlink"/>
@@ -1182,44 +840,6 @@
           <w:i w:val="false"/>
           <w:iCs w:val="false"/>
         </w:rPr>
-        <w:t xml:space="preserve">Park, S. K., Rhee, M. K., &amp; Lee, S. W. (2021). The effects of job demands and resources on turnover intention: The mediating roles of emotional exhaustion and depersonalization. </w:t>
-      </w:r>
-      <w:r>
-        <w:rPr>
-          <w:i/>
-          <w:iCs/>
-        </w:rPr>
-        <w:t xml:space="preserve">Work, 70</w:t>
-      </w:r>
-      <w:r>
-        <w:rPr>
-          <w:i w:val="false"/>
-          <w:iCs w:val="false"/>
-        </w:rPr>
-        <w:t xml:space="preserve">(1), 301–309.</w:t>
-      </w:r>
-      <w:r>
-        <w:t xml:space="preserve"> Publisher page: </w:t>
-      </w:r>
-      <w:hyperlink w:history="1" r:id="rId2t5sutoraogc05hwd7o-s">
-        <w:r>
-          <w:rPr>
-            <w:rStyle w:val="Hyperlink"/>
-          </w:rPr>
-          <w:t xml:space="preserve">https://doi.org/10.3233/WOR-213574</w:t>
-        </w:r>
-      </w:hyperlink>
-    </w:p>
-    <w:p>
-      <w:pPr>
-        <w:spacing w:after="160" w:line="360"/>
-        <w:ind w:left="720" w:hanging="720"/>
-      </w:pPr>
-      <w:r>
-        <w:rPr>
-          <w:i w:val="false"/>
-          <w:iCs w:val="false"/>
-        </w:rPr>
         <w:t xml:space="preserve">Samuel, M. O., &amp; Chipunza, C. (2009). Employee retention and turnover: Using motivational variables as a panacea. </w:t>
       </w:r>
       <w:r>
@@ -1239,7 +859,7 @@
       <w:r>
         <w:t xml:space="preserve"> Full text (free): </w:t>
       </w:r>
-      <w:hyperlink w:history="1" r:id="rId1an5wzxc3114aky6tcck3">
+      <w:hyperlink w:history="1" r:id="rIdi0a4w94kejl04sdvihgth">
         <w:r>
           <w:rPr>
             <w:rStyle w:val="Hyperlink"/>
@@ -1258,140 +878,26 @@
           <w:i w:val="false"/>
           <w:iCs w:val="false"/>
         </w:rPr>
-        <w:t xml:space="preserve">Shin, Y., Hur, W. M., Park, K., &amp; Hwang, H. (2020). How managers’ job crafting reduces turnover intention: The mediating roles of role ambiguity and emotional exhaustion. </w:t>
-      </w:r>
-      <w:r>
-        <w:rPr>
-          <w:i/>
-          <w:iCs/>
-        </w:rPr>
-        <w:t xml:space="preserve">International Journal of Environmental Research and Public Health, 17</w:t>
-      </w:r>
-      <w:r>
-        <w:rPr>
-          <w:i w:val="false"/>
-          <w:iCs w:val="false"/>
-        </w:rPr>
-        <w:t xml:space="preserve">(11), 3972.</w:t>
+        <w:t xml:space="preserve">Timms, C., Brough, P., O’Driscoll, M., Kalliath, T., Siu, O. L., Sit, C., &amp; Lo, D. (2015). Flexible work arrangements, work engagement, turnover intentions and psychological health. </w:t>
+      </w:r>
+      <w:r>
+        <w:rPr>
+          <w:i/>
+          <w:iCs/>
+        </w:rPr>
+        <w:t xml:space="preserve">Asia Pacific Journal of Human Resources, 53</w:t>
+      </w:r>
+      <w:r>
+        <w:rPr>
+          <w:i w:val="false"/>
+          <w:iCs w:val="false"/>
+        </w:rPr>
+        <w:t xml:space="preserve">(1), 83–103.</w:t>
       </w:r>
       <w:r>
         <w:t xml:space="preserve"> Full text (free): </w:t>
       </w:r>
-      <w:hyperlink w:history="1" r:id="rIdkf4cy5brpdfxlxdia5wcr">
-        <w:r>
-          <w:rPr>
-            <w:rStyle w:val="Hyperlink"/>
-          </w:rPr>
-          <w:t xml:space="preserve">https://www.mdpi.com/1660-4601/17/11/3972</w:t>
-        </w:r>
-      </w:hyperlink>
-    </w:p>
-    <w:p>
-      <w:pPr>
-        <w:spacing w:after="160" w:line="360"/>
-        <w:ind w:left="720" w:hanging="720"/>
-      </w:pPr>
-      <w:r>
-        <w:rPr>
-          <w:i w:val="false"/>
-          <w:iCs w:val="false"/>
-        </w:rPr>
-        <w:t xml:space="preserve">Swider, B. W., &amp; Zimmerman, R. D. (2010). Born to burnout: A meta-analytic path model of personality, job burnout, and work outcomes. </w:t>
-      </w:r>
-      <w:r>
-        <w:rPr>
-          <w:i/>
-          <w:iCs/>
-        </w:rPr>
-        <w:t xml:space="preserve">Journal of Vocational Behavior, 76</w:t>
-      </w:r>
-      <w:r>
-        <w:rPr>
-          <w:i w:val="false"/>
-          <w:iCs w:val="false"/>
-        </w:rPr>
-        <w:t xml:space="preserve">(3), 487–506.</w:t>
-      </w:r>
-      <w:r>
-        <w:t xml:space="preserve"> Publisher page: </w:t>
-      </w:r>
-      <w:hyperlink w:history="1" r:id="rId24rgpxhvefvaqlc-dou_z">
-        <w:r>
-          <w:rPr>
-            <w:rStyle w:val="Hyperlink"/>
-          </w:rPr>
-          <w:t xml:space="preserve">https://www.sciencedirect.com/science/article/pii/S0001879110000047</w:t>
-        </w:r>
-      </w:hyperlink>
-    </w:p>
-    <w:p>
-      <w:pPr>
-        <w:spacing w:after="160" w:line="360"/>
-        <w:ind w:left="720" w:hanging="720"/>
-      </w:pPr>
-      <w:r>
-        <w:rPr>
-          <w:i w:val="false"/>
-          <w:iCs w:val="false"/>
-        </w:rPr>
-        <w:t xml:space="preserve">Tett, R. P., &amp; Meyer, J. P. (1993). Job satisfaction, organizational commitment, turnover intention, and turnover: Path analyses based on meta-analytic findings. </w:t>
-      </w:r>
-      <w:r>
-        <w:rPr>
-          <w:i/>
-          <w:iCs/>
-        </w:rPr>
-        <w:t xml:space="preserve">Personnel Psychology, 46</w:t>
-      </w:r>
-      <w:r>
-        <w:rPr>
-          <w:i w:val="false"/>
-          <w:iCs w:val="false"/>
-        </w:rPr>
-        <w:t xml:space="preserve">(2), 259–293.</w:t>
-      </w:r>
-      <w:r>
-        <w:t xml:space="preserve"> Publisher page: </w:t>
-      </w:r>
-      <w:hyperlink w:history="1" r:id="rId5_lj_maicq01zkaxsg9wl">
-        <w:r>
-          <w:rPr>
-            <w:rStyle w:val="Hyperlink"/>
-          </w:rPr>
-          <w:t xml:space="preserve">https://doi.org/10.1111/j.1744-6570.1993.tb00874.x</w:t>
-        </w:r>
-      </w:hyperlink>
-    </w:p>
-    <w:p>
-      <w:pPr>
-        <w:spacing w:after="160" w:line="360"/>
-        <w:ind w:left="720" w:hanging="720"/>
-      </w:pPr>
-      <w:r>
-        <w:rPr>
-          <w:i w:val="false"/>
-          <w:iCs w:val="false"/>
-        </w:rPr>
-        <w:t xml:space="preserve">Timms, C., Brough, P., O’Driscoll, M., Kalliath, T., Siu, O. L., Sit, C., &amp; Lo, D. (2015). Flexible work arrangements, work engagement, turnover intentions and psychological health. </w:t>
-      </w:r>
-      <w:r>
-        <w:rPr>
-          <w:i/>
-          <w:iCs/>
-        </w:rPr>
-        <w:t xml:space="preserve">Asia Pacific Journal of Human Resources, 53</w:t>
-      </w:r>
-      <w:r>
-        <w:rPr>
-          <w:i w:val="false"/>
-          <w:iCs w:val="false"/>
-        </w:rPr>
-        <w:t xml:space="preserve">(1), 83–103.</w:t>
-      </w:r>
-      <w:r>
-        <w:t xml:space="preserve"> Full text (free): </w:t>
-      </w:r>
-      <w:hyperlink w:history="1" r:id="rIdohk-waapqmidizgffusxz">
+      <w:hyperlink w:history="1" r:id="rId829ebfnf5vctfsbdcujrq">
         <w:r>
           <w:rPr>
             <w:rStyle w:val="Hyperlink"/>
@@ -1429,7 +935,7 @@
       <w:r>
         <w:t xml:space="preserve"> Full text (free): </w:t>
       </w:r>
-      <w:hyperlink w:history="1" r:id="rIdyttj1qfgsehgspne-jduo">
+      <w:hyperlink w:history="1" r:id="rId90kvb9q1yt2n5gexhojzz">
         <w:r>
           <w:rPr>
             <w:rStyle w:val="Hyperlink"/>
@@ -1467,50 +973,12 @@
       <w:r>
         <w:t xml:space="preserve"> Full text (free): </w:t>
       </w:r>
-      <w:hyperlink w:history="1" r:id="rIdpim6yfq4ueeihgdwpdzin">
+      <w:hyperlink w:history="1" r:id="rIdukrsije49is_mm94umgta">
         <w:r>
           <w:rPr>
             <w:rStyle w:val="Hyperlink"/>
           </w:rPr>
           <w:t xml:space="preserve">https://www.abmgg.org/wp-content/uploads/2026/04/Interventions-to-prevent-and-reduce-physician-burnout.pdf</w:t>
-        </w:r>
-      </w:hyperlink>
-    </w:p>
-    <w:p>
-      <w:pPr>
-        <w:spacing w:after="160" w:line="360"/>
-        <w:ind w:left="720" w:hanging="720"/>
-      </w:pPr>
-      <w:r>
-        <w:rPr>
-          <w:i w:val="false"/>
-          <w:iCs w:val="false"/>
-        </w:rPr>
-        <w:t xml:space="preserve">Zambrano-Chumo, L., &amp; Guevara, R. (2024). Psychological capital and turnover intention: The mediating role of burnout among healthcare professionals. </w:t>
-      </w:r>
-      <w:r>
-        <w:rPr>
-          <w:i/>
-          <w:iCs/>
-        </w:rPr>
-        <w:t xml:space="preserve">International Journal of Environmental Research and Public Health, 21</w:t>
-      </w:r>
-      <w:r>
-        <w:rPr>
-          <w:i w:val="false"/>
-          <w:iCs w:val="false"/>
-        </w:rPr>
-        <w:t xml:space="preserve">(2), 185.</w:t>
-      </w:r>
-      <w:r>
-        <w:t xml:space="preserve"> Full text (free): </w:t>
-      </w:r>
-      <w:hyperlink w:history="1" r:id="rIdqoruytvlu0zqa-8dyqzhl">
-        <w:r>
-          <w:rPr>
-            <w:rStyle w:val="Hyperlink"/>
-          </w:rPr>
-          <w:t xml:space="preserve">https://www.mdpi.com/1660-4601/21/2/185</w:t>
         </w:r>
       </w:hyperlink>
     </w:p>

</xml_diff>

<commit_message>
Replace section 2.3.3 with a single subchapter on organizational support and burnout
Co-Authored-By: Claude Opus 5.5 <noreply@anthropic.com>
Claude-Session: https://claude.ai/code/session_01MuZJEATuP8hgu3rD83iwL2
</commit_message>
<xml_diff>
--- a/Burnout_Turnover_Intention_Outline.docx
+++ b/Burnout_Turnover_Intention_Outline.docx
@@ -447,103 +447,19 @@
         <w:ind w:left="360"/>
       </w:pPr>
       <w:r>
-        <w:t xml:space="preserve">2.3.3. Types and Benefits of Job and Personal Resources That Buffer Burnout-Driven Turnover</w:t>
-      </w:r>
-      <w:r>
-        <w:rPr>
-          <w:b w:val="false"/>
-          <w:bCs w:val="false"/>
-          <w:i/>
-          <w:iCs/>
-          <w:color w:val="555555"/>
-          <w:sz w:val="20"/>
-          <w:szCs w:val="20"/>
-        </w:rPr>
-        <w:t xml:space="preserve"> (Chênevert et al., 2021; Chen et al., 2024)</w:t>
-      </w:r>
-    </w:p>
-    <w:p>
-      <w:pPr>
-        <w:pStyle w:val="Heading4"/>
-        <w:ind w:left="720"/>
-      </w:pPr>
-      <w:r>
-        <w:t xml:space="preserve">2.3.3.1. Social Support as a Buffer Against Burnout and Turnover Intention</w:t>
-      </w:r>
-      <w:r>
-        <w:rPr>
-          <w:b w:val="false"/>
-          <w:bCs w:val="false"/>
-          <w:i/>
-          <w:iCs/>
-          <w:color w:val="555555"/>
-          <w:sz w:val="20"/>
-          <w:szCs w:val="20"/>
-        </w:rPr>
-        <w:t xml:space="preserve"> (Chen et al., 2024)</w:t>
-      </w:r>
-    </w:p>
-    <w:p>
-      <w:pPr>
-        <w:pStyle w:val="Heading4"/>
-        <w:ind w:left="720"/>
-      </w:pPr>
-      <w:r>
-        <w:t xml:space="preserve">2.3.3.2. Psychological Capital as a Personal Resource Against Burnout-Driven Turnover</w:t>
-      </w:r>
-      <w:r>
-        <w:rPr>
-          <w:b w:val="false"/>
-          <w:bCs w:val="false"/>
-          <w:i/>
-          <w:iCs/>
-          <w:color w:val="555555"/>
-          <w:sz w:val="20"/>
-          <w:szCs w:val="20"/>
-        </w:rPr>
-        <w:t xml:space="preserve"> (Chen et al., 2024)</w:t>
-      </w:r>
-    </w:p>
-    <w:p>
-      <w:pPr>
-        <w:pStyle w:val="Heading4"/>
-        <w:ind w:left="720"/>
-      </w:pPr>
-      <w:r>
-        <w:t xml:space="preserve">2.3.3.3. Job Crafting as a Means of Reducing Burnout and Intention to Leave</w:t>
-      </w:r>
-      <w:r>
-        <w:rPr>
-          <w:b w:val="false"/>
-          <w:bCs w:val="false"/>
-          <w:i/>
-          <w:iCs/>
-          <w:color w:val="555555"/>
-          <w:sz w:val="20"/>
-          <w:szCs w:val="20"/>
-        </w:rPr>
-        <w:t xml:space="preserve"> (Dominguez et al., 2018)</w:t>
-      </w:r>
-    </w:p>
-    <w:p>
-      <w:pPr>
-        <w:pStyle w:val="Heading4"/>
-        <w:ind w:left="720"/>
-      </w:pPr>
-      <w:r>
-        <w:t xml:space="preserve">2.3.3.4. Organizational Support and Flexible Work as Protective Resources</w:t>
-      </w:r>
-      <w:r>
-        <w:rPr>
-          <w:b w:val="false"/>
-          <w:bCs w:val="false"/>
-          <w:i/>
-          <w:iCs/>
-          <w:color w:val="555555"/>
-          <w:sz w:val="20"/>
-          <w:szCs w:val="20"/>
-        </w:rPr>
-        <w:t xml:space="preserve"> (Wang &amp; Wang, 2020; Timms et al., 2015)</w:t>
+        <w:t xml:space="preserve">2.3.3. Perceived Organizational Support, Burnout, and Turnover Intention Among Frontline Employees</w:t>
+      </w:r>
+      <w:r>
+        <w:rPr>
+          <w:b w:val="false"/>
+          <w:bCs w:val="false"/>
+          <w:i/>
+          <w:iCs/>
+          <w:color w:val="555555"/>
+          <w:sz w:val="20"/>
+          <w:szCs w:val="20"/>
+        </w:rPr>
+        <w:t xml:space="preserve"> (Wang &amp; Wang, 2020)</w:t>
       </w:r>
     </w:p>
     <w:p>
@@ -631,7 +547,7 @@
       <w:r>
         <w:t xml:space="preserve"> Full text (free): </w:t>
       </w:r>
-      <w:hyperlink w:history="1" r:id="rIdntyxuh2iyy6b3d5h1ota-">
+      <w:hyperlink w:history="1" r:id="rIdzl0gbmzbsbrvsczsoled7">
         <w:r>
           <w:rPr>
             <w:rStyle w:val="Hyperlink"/>
@@ -669,7 +585,7 @@
       <w:r>
         <w:t xml:space="preserve"> Full text (free): </w:t>
       </w:r>
-      <w:hyperlink w:history="1" r:id="rIdxgas92qt4mpejaox9dtdm">
+      <w:hyperlink w:history="1" r:id="rIdpu2sh2rgkoaou9-iurcne">
         <w:r>
           <w:rPr>
             <w:rStyle w:val="Hyperlink"/>
@@ -707,7 +623,7 @@
       <w:r>
         <w:t xml:space="preserve"> Full text (free): </w:t>
       </w:r>
-      <w:hyperlink w:history="1" r:id="rId0biytbursninti3e0m5nv">
+      <w:hyperlink w:history="1" r:id="rIdhjk_d1ob3shz-ycfhui1j">
         <w:r>
           <w:rPr>
             <w:rStyle w:val="Hyperlink"/>
@@ -745,7 +661,7 @@
       <w:r>
         <w:t xml:space="preserve"> Full text (free): </w:t>
       </w:r>
-      <w:hyperlink w:history="1" r:id="rIdoxa8nze8fx7bahoo8vz7l">
+      <w:hyperlink w:history="1" r:id="rId8-h6nwuumbzyjzj5zo-ek">
         <w:r>
           <w:rPr>
             <w:rStyle w:val="Hyperlink"/>
@@ -783,7 +699,7 @@
       <w:r>
         <w:t xml:space="preserve"> Full text (free): </w:t>
       </w:r>
-      <w:hyperlink w:history="1" r:id="rIddhybgczozpjpb9etot5gn">
+      <w:hyperlink w:history="1" r:id="rIdpwryc3zdlqovudi4yo8gz">
         <w:r>
           <w:rPr>
             <w:rStyle w:val="Hyperlink"/>
@@ -821,7 +737,7 @@
       <w:r>
         <w:t xml:space="preserve"> Full text (free): </w:t>
       </w:r>
-      <w:hyperlink w:history="1" r:id="rIdyyhi-b7jhmuja5copo7sj">
+      <w:hyperlink w:history="1" r:id="rIdpjk5z10updsmyg12omc3d">
         <w:r>
           <w:rPr>
             <w:rStyle w:val="Hyperlink"/>
@@ -859,7 +775,7 @@
       <w:r>
         <w:t xml:space="preserve"> Full text (free): </w:t>
       </w:r>
-      <w:hyperlink w:history="1" r:id="rIdi0a4w94kejl04sdvihgth">
+      <w:hyperlink w:history="1" r:id="rIdzx-awzthctlcqtt0jm7ji">
         <w:r>
           <w:rPr>
             <w:rStyle w:val="Hyperlink"/>
@@ -897,7 +813,7 @@
       <w:r>
         <w:t xml:space="preserve"> Full text (free): </w:t>
       </w:r>
-      <w:hyperlink w:history="1" r:id="rId829ebfnf5vctfsbdcujrq">
+      <w:hyperlink w:history="1" r:id="rIdzq5mgn_kkwtujoagpsape">
         <w:r>
           <w:rPr>
             <w:rStyle w:val="Hyperlink"/>
@@ -935,7 +851,7 @@
       <w:r>
         <w:t xml:space="preserve"> Full text (free): </w:t>
       </w:r>
-      <w:hyperlink w:history="1" r:id="rId90kvb9q1yt2n5gexhojzz">
+      <w:hyperlink w:history="1" r:id="rIdp4gadop1f6yqjwrl3lfkx">
         <w:r>
           <w:rPr>
             <w:rStyle w:val="Hyperlink"/>
@@ -973,7 +889,7 @@
       <w:r>
         <w:t xml:space="preserve"> Full text (free): </w:t>
       </w:r>
-      <w:hyperlink w:history="1" r:id="rIdukrsije49is_mm94umgta">
+      <w:hyperlink w:history="1" r:id="rIdtpy3i3et4ltl-fbaayhty">
         <w:r>
           <w:rPr>
             <w:rStyle w:val="Hyperlink"/>

</xml_diff>